<commit_message>
Les captures du guide sortaient à 75 % de leur taille
`ImageRun.transformation` de docx compte en pixels à 96 dpi, pas en points :
le téléphone réglé sur 26 mm s'imprimait à 19,5 mm, et le code d'installation
avec lui. Mesuré sur le PDF produit — 69 px à 90 dpi.

Les captures passent dans le téléphone de la charte (`cadrer`, le même que les
diapos), à 34 mm de large. Aucune coupe : plusieurs écrans portent leur bouton
en bas, et le repère cité à côté montrerait alors ce que l'image ne contient
pas — une garde le vérifie et fait échouer la génération.

Le texte se centre en face du téléphone, les hauteurs de ligne fantômes des
paragraphes vides sont retirées : huit étapes tiennent en trois pages, code
d'installation et pied compris. Décodé à 600 dpi depuis le PDF final.

Aucun deck régénéré.

Co-Authored-By: Claude Opus 5 <noreply@anthropic.com>
</commit_message>
<xml_diff>
--- a/docs/entreprise/prise-en-main/Quantinvo-prise-en-main-compteur.docx
+++ b/docs/entreprise/prise-en-main/Quantinvo-prise-en-main-compteur.docx
@@ -171,12 +171,12 @@
         <w:pBdr>
           <w:bottom w:val="single" w:color="14181A" w:sz="8" w:space="6"/>
         </w:pBdr>
-        <w:spacing w:after="60" w:before="0"/>
+        <w:spacing w:after="60" w:before="0" w:line="20"/>
       </w:pPr>
     </w:p>
     <w:p>
       <w:pPr>
-        <w:spacing w:after="90" w:before="180"/>
+        <w:spacing w:after="80" w:before="110"/>
       </w:pPr>
       <w:r>
         <w:rPr>
@@ -206,7 +206,7 @@
     </w:p>
     <w:p>
       <w:pPr>
-        <w:spacing w:after="220" w:before="0"/>
+        <w:spacing w:after="150" w:before="0"/>
       </w:pPr>
       <w:r>
         <w:rPr>
@@ -222,7 +222,7 @@
     </w:p>
     <w:tbl>
       <w:tblPr>
-        <w:tblW w:type="dxa" w:w="10203"/>
+        <w:tblW w:type="dxa" w:w="10204"/>
         <w:tblBorders>
           <w:top w:val="none" w:color="FFFFFF" w:sz="0"/>
           <w:left w:val="none" w:color="FFFFFF" w:sz="0"/>
@@ -233,24 +233,24 @@
         </w:tblBorders>
       </w:tblPr>
       <w:tblGrid>
-        <w:gridCol w:w="1700"/>
-        <w:gridCol w:w="8503"/>
+        <w:gridCol w:w="2211"/>
+        <w:gridCol w:w="7993"/>
       </w:tblGrid>
       <w:tr>
         <w:tc>
           <w:tcPr>
-            <w:tcW w:type="dxa" w:w="1700"/>
-            <w:tcBorders>
-              <w:top w:val="none" w:color="FFFFFF" w:sz="0"/>
-              <w:left w:val="none" w:color="FFFFFF" w:sz="0"/>
-              <w:bottom w:val="none" w:color="FFFFFF" w:sz="0"/>
-              <w:right w:val="none" w:color="FFFFFF" w:sz="0"/>
-            </w:tcBorders>
-            <w:tcMar>
-              <w:top w:type="dxa" w:w="0"/>
-              <w:left w:type="dxa" w:w="0"/>
-              <w:bottom w:type="dxa" w:w="0"/>
-              <w:right w:type="dxa" w:w="226"/>
+            <w:tcW w:type="dxa" w:w="2211"/>
+            <w:tcBorders>
+              <w:top w:val="none" w:color="FFFFFF" w:sz="0"/>
+              <w:left w:val="none" w:color="FFFFFF" w:sz="0"/>
+              <w:bottom w:val="none" w:color="FFFFFF" w:sz="0"/>
+              <w:right w:val="none" w:color="FFFFFF" w:sz="0"/>
+            </w:tcBorders>
+            <w:tcMar>
+              <w:top w:type="dxa" w:w="0"/>
+              <w:left w:type="dxa" w:w="0"/>
+              <w:bottom w:type="dxa" w:w="0"/>
+              <w:right w:type="dxa" w:w="283"/>
             </w:tcMar>
             <w:vAlign w:val="top"/>
           </w:tcPr>
@@ -261,7 +261,7 @@
             <w:r>
               <w:drawing>
                 <wp:inline distT="0" distB="0" distL="0" distR="0">
-                  <wp:extent cx="701989" cy="1525475"/>
+                  <wp:extent cx="1224000" cy="2584427"/>
                   <wp:effectExtent t="0" r="0" b="0" l="0"/>
                   <wp:docPr id="1" name="" descr="" title=""/>
                   <wp:cNvGraphicFramePr>
@@ -286,7 +286,7 @@
                         <pic:spPr bwMode="auto">
                           <a:xfrm>
                             <a:off x="0" y="0"/>
-                            <a:ext cx="701989" cy="1525475"/>
+                            <a:ext cx="1224000" cy="2584427"/>
                           </a:xfrm>
                           <a:prstGeom prst="rect">
                             <a:avLst/>
@@ -302,7 +302,7 @@
         </w:tc>
         <w:tc>
           <w:tcPr>
-            <w:tcW w:type="dxa" w:w="8503"/>
+            <w:tcW w:type="dxa" w:w="7993"/>
             <w:tcBorders>
               <w:top w:val="none" w:color="FFFFFF" w:sz="0"/>
               <w:left w:val="none" w:color="FFFFFF" w:sz="0"/>
@@ -315,7 +315,7 @@
               <w:bottom w:type="dxa" w:w="0"/>
               <w:right w:type="dxa" w:w="0"/>
             </w:tcMar>
-            <w:vAlign w:val="top"/>
+            <w:vAlign w:val="center"/>
           </w:tcPr>
           <w:p>
             <w:pPr>
@@ -379,7 +379,7 @@
       <w:tr>
         <w:tc>
           <w:tcPr>
-            <w:tcW w:type="dxa" w:w="1700"/>
+            <w:tcW w:type="dxa" w:w="2211"/>
             <w:tcBorders>
               <w:top w:val="none" w:color="FFFFFF" w:sz="0"/>
               <w:left w:val="none" w:color="FFFFFF" w:sz="0"/>
@@ -396,13 +396,13 @@
           </w:tcPr>
           <w:p>
             <w:pPr>
-              <w:spacing w:after="160"/>
-            </w:pPr>
-          </w:p>
-        </w:tc>
-        <w:tc>
-          <w:tcPr>
-            <w:tcW w:type="dxa" w:w="8503"/>
+              <w:spacing w:after="130" w:line="20"/>
+            </w:pPr>
+          </w:p>
+        </w:tc>
+        <w:tc>
+          <w:tcPr>
+            <w:tcW w:type="dxa" w:w="7993"/>
             <w:tcBorders>
               <w:top w:val="none" w:color="FFFFFF" w:sz="0"/>
               <w:left w:val="none" w:color="FFFFFF" w:sz="0"/>
@@ -427,18 +427,18 @@
       <w:tr>
         <w:tc>
           <w:tcPr>
-            <w:tcW w:type="dxa" w:w="1700"/>
-            <w:tcBorders>
-              <w:top w:val="none" w:color="FFFFFF" w:sz="0"/>
-              <w:left w:val="none" w:color="FFFFFF" w:sz="0"/>
-              <w:bottom w:val="none" w:color="FFFFFF" w:sz="0"/>
-              <w:right w:val="none" w:color="FFFFFF" w:sz="0"/>
-            </w:tcBorders>
-            <w:tcMar>
-              <w:top w:type="dxa" w:w="0"/>
-              <w:left w:type="dxa" w:w="0"/>
-              <w:bottom w:type="dxa" w:w="0"/>
-              <w:right w:type="dxa" w:w="226"/>
+            <w:tcW w:type="dxa" w:w="2211"/>
+            <w:tcBorders>
+              <w:top w:val="none" w:color="FFFFFF" w:sz="0"/>
+              <w:left w:val="none" w:color="FFFFFF" w:sz="0"/>
+              <w:bottom w:val="none" w:color="FFFFFF" w:sz="0"/>
+              <w:right w:val="none" w:color="FFFFFF" w:sz="0"/>
+            </w:tcBorders>
+            <w:tcMar>
+              <w:top w:type="dxa" w:w="0"/>
+              <w:left w:type="dxa" w:w="0"/>
+              <w:bottom w:type="dxa" w:w="0"/>
+              <w:right w:type="dxa" w:w="283"/>
             </w:tcMar>
             <w:vAlign w:val="top"/>
           </w:tcPr>
@@ -449,7 +449,7 @@
             <w:r>
               <w:drawing>
                 <wp:inline distT="0" distB="0" distL="0" distR="0">
-                  <wp:extent cx="701989" cy="1525475"/>
+                  <wp:extent cx="1224000" cy="2584427"/>
                   <wp:effectExtent t="0" r="0" b="0" l="0"/>
                   <wp:docPr id="2" name="" descr="" title=""/>
                   <wp:cNvGraphicFramePr>
@@ -474,7 +474,7 @@
                         <pic:spPr bwMode="auto">
                           <a:xfrm>
                             <a:off x="0" y="0"/>
-                            <a:ext cx="701989" cy="1525475"/>
+                            <a:ext cx="1224000" cy="2584427"/>
                           </a:xfrm>
                           <a:prstGeom prst="rect">
                             <a:avLst/>
@@ -490,7 +490,7 @@
         </w:tc>
         <w:tc>
           <w:tcPr>
-            <w:tcW w:type="dxa" w:w="8503"/>
+            <w:tcW w:type="dxa" w:w="7993"/>
             <w:tcBorders>
               <w:top w:val="none" w:color="FFFFFF" w:sz="0"/>
               <w:left w:val="none" w:color="FFFFFF" w:sz="0"/>
@@ -503,7 +503,7 @@
               <w:bottom w:type="dxa" w:w="0"/>
               <w:right w:type="dxa" w:w="0"/>
             </w:tcMar>
-            <w:vAlign w:val="top"/>
+            <w:vAlign w:val="center"/>
           </w:tcPr>
           <w:p>
             <w:pPr>
@@ -567,7 +567,7 @@
       <w:tr>
         <w:tc>
           <w:tcPr>
-            <w:tcW w:type="dxa" w:w="1700"/>
+            <w:tcW w:type="dxa" w:w="2211"/>
             <w:tcBorders>
               <w:top w:val="none" w:color="FFFFFF" w:sz="0"/>
               <w:left w:val="none" w:color="FFFFFF" w:sz="0"/>
@@ -584,13 +584,13 @@
           </w:tcPr>
           <w:p>
             <w:pPr>
-              <w:spacing w:after="160"/>
-            </w:pPr>
-          </w:p>
-        </w:tc>
-        <w:tc>
-          <w:tcPr>
-            <w:tcW w:type="dxa" w:w="8503"/>
+              <w:spacing w:after="130" w:line="20"/>
+            </w:pPr>
+          </w:p>
+        </w:tc>
+        <w:tc>
+          <w:tcPr>
+            <w:tcW w:type="dxa" w:w="7993"/>
             <w:tcBorders>
               <w:top w:val="none" w:color="FFFFFF" w:sz="0"/>
               <w:left w:val="none" w:color="FFFFFF" w:sz="0"/>
@@ -615,18 +615,18 @@
       <w:tr>
         <w:tc>
           <w:tcPr>
-            <w:tcW w:type="dxa" w:w="1700"/>
-            <w:tcBorders>
-              <w:top w:val="none" w:color="FFFFFF" w:sz="0"/>
-              <w:left w:val="none" w:color="FFFFFF" w:sz="0"/>
-              <w:bottom w:val="none" w:color="FFFFFF" w:sz="0"/>
-              <w:right w:val="none" w:color="FFFFFF" w:sz="0"/>
-            </w:tcBorders>
-            <w:tcMar>
-              <w:top w:type="dxa" w:w="0"/>
-              <w:left w:type="dxa" w:w="0"/>
-              <w:bottom w:type="dxa" w:w="0"/>
-              <w:right w:type="dxa" w:w="226"/>
+            <w:tcW w:type="dxa" w:w="2211"/>
+            <w:tcBorders>
+              <w:top w:val="none" w:color="FFFFFF" w:sz="0"/>
+              <w:left w:val="none" w:color="FFFFFF" w:sz="0"/>
+              <w:bottom w:val="none" w:color="FFFFFF" w:sz="0"/>
+              <w:right w:val="none" w:color="FFFFFF" w:sz="0"/>
+            </w:tcBorders>
+            <w:tcMar>
+              <w:top w:type="dxa" w:w="0"/>
+              <w:left w:type="dxa" w:w="0"/>
+              <w:bottom w:type="dxa" w:w="0"/>
+              <w:right w:type="dxa" w:w="283"/>
             </w:tcMar>
             <w:vAlign w:val="top"/>
           </w:tcPr>
@@ -637,7 +637,7 @@
             <w:r>
               <w:drawing>
                 <wp:inline distT="0" distB="0" distL="0" distR="0">
-                  <wp:extent cx="701989" cy="1525475"/>
+                  <wp:extent cx="1224000" cy="2584427"/>
                   <wp:effectExtent t="0" r="0" b="0" l="0"/>
                   <wp:docPr id="3" name="" descr="" title=""/>
                   <wp:cNvGraphicFramePr>
@@ -662,7 +662,7 @@
                         <pic:spPr bwMode="auto">
                           <a:xfrm>
                             <a:off x="0" y="0"/>
-                            <a:ext cx="701989" cy="1525475"/>
+                            <a:ext cx="1224000" cy="2584427"/>
                           </a:xfrm>
                           <a:prstGeom prst="rect">
                             <a:avLst/>
@@ -678,7 +678,7 @@
         </w:tc>
         <w:tc>
           <w:tcPr>
-            <w:tcW w:type="dxa" w:w="8503"/>
+            <w:tcW w:type="dxa" w:w="7993"/>
             <w:tcBorders>
               <w:top w:val="none" w:color="FFFFFF" w:sz="0"/>
               <w:left w:val="none" w:color="FFFFFF" w:sz="0"/>
@@ -691,7 +691,7 @@
               <w:bottom w:type="dxa" w:w="0"/>
               <w:right w:type="dxa" w:w="0"/>
             </w:tcMar>
-            <w:vAlign w:val="top"/>
+            <w:vAlign w:val="center"/>
           </w:tcPr>
           <w:p>
             <w:pPr>
@@ -755,7 +755,7 @@
       <w:tr>
         <w:tc>
           <w:tcPr>
-            <w:tcW w:type="dxa" w:w="1700"/>
+            <w:tcW w:type="dxa" w:w="2211"/>
             <w:tcBorders>
               <w:top w:val="none" w:color="FFFFFF" w:sz="0"/>
               <w:left w:val="none" w:color="FFFFFF" w:sz="0"/>
@@ -772,13 +772,13 @@
           </w:tcPr>
           <w:p>
             <w:pPr>
-              <w:spacing w:after="160"/>
-            </w:pPr>
-          </w:p>
-        </w:tc>
-        <w:tc>
-          <w:tcPr>
-            <w:tcW w:type="dxa" w:w="8503"/>
+              <w:spacing w:after="130" w:line="20"/>
+            </w:pPr>
+          </w:p>
+        </w:tc>
+        <w:tc>
+          <w:tcPr>
+            <w:tcW w:type="dxa" w:w="7993"/>
             <w:tcBorders>
               <w:top w:val="none" w:color="FFFFFF" w:sz="0"/>
               <w:left w:val="none" w:color="FFFFFF" w:sz="0"/>
@@ -803,18 +803,18 @@
       <w:tr>
         <w:tc>
           <w:tcPr>
-            <w:tcW w:type="dxa" w:w="1700"/>
-            <w:tcBorders>
-              <w:top w:val="none" w:color="FFFFFF" w:sz="0"/>
-              <w:left w:val="none" w:color="FFFFFF" w:sz="0"/>
-              <w:bottom w:val="none" w:color="FFFFFF" w:sz="0"/>
-              <w:right w:val="none" w:color="FFFFFF" w:sz="0"/>
-            </w:tcBorders>
-            <w:tcMar>
-              <w:top w:type="dxa" w:w="0"/>
-              <w:left w:type="dxa" w:w="0"/>
-              <w:bottom w:type="dxa" w:w="0"/>
-              <w:right w:type="dxa" w:w="226"/>
+            <w:tcW w:type="dxa" w:w="2211"/>
+            <w:tcBorders>
+              <w:top w:val="none" w:color="FFFFFF" w:sz="0"/>
+              <w:left w:val="none" w:color="FFFFFF" w:sz="0"/>
+              <w:bottom w:val="none" w:color="FFFFFF" w:sz="0"/>
+              <w:right w:val="none" w:color="FFFFFF" w:sz="0"/>
+            </w:tcBorders>
+            <w:tcMar>
+              <w:top w:type="dxa" w:w="0"/>
+              <w:left w:type="dxa" w:w="0"/>
+              <w:bottom w:type="dxa" w:w="0"/>
+              <w:right w:type="dxa" w:w="283"/>
             </w:tcMar>
             <w:vAlign w:val="top"/>
           </w:tcPr>
@@ -825,7 +825,7 @@
             <w:r>
               <w:drawing>
                 <wp:inline distT="0" distB="0" distL="0" distR="0">
-                  <wp:extent cx="701989" cy="1525475"/>
+                  <wp:extent cx="1224000" cy="2584427"/>
                   <wp:effectExtent t="0" r="0" b="0" l="0"/>
                   <wp:docPr id="4" name="" descr="" title=""/>
                   <wp:cNvGraphicFramePr>
@@ -850,7 +850,7 @@
                         <pic:spPr bwMode="auto">
                           <a:xfrm>
                             <a:off x="0" y="0"/>
-                            <a:ext cx="701989" cy="1525475"/>
+                            <a:ext cx="1224000" cy="2584427"/>
                           </a:xfrm>
                           <a:prstGeom prst="rect">
                             <a:avLst/>
@@ -866,7 +866,7 @@
         </w:tc>
         <w:tc>
           <w:tcPr>
-            <w:tcW w:type="dxa" w:w="8503"/>
+            <w:tcW w:type="dxa" w:w="7993"/>
             <w:tcBorders>
               <w:top w:val="none" w:color="FFFFFF" w:sz="0"/>
               <w:left w:val="none" w:color="FFFFFF" w:sz="0"/>
@@ -879,7 +879,7 @@
               <w:bottom w:type="dxa" w:w="0"/>
               <w:right w:type="dxa" w:w="0"/>
             </w:tcMar>
-            <w:vAlign w:val="top"/>
+            <w:vAlign w:val="center"/>
           </w:tcPr>
           <w:p>
             <w:pPr>
@@ -943,7 +943,7 @@
       <w:tr>
         <w:tc>
           <w:tcPr>
-            <w:tcW w:type="dxa" w:w="1700"/>
+            <w:tcW w:type="dxa" w:w="2211"/>
             <w:tcBorders>
               <w:top w:val="none" w:color="FFFFFF" w:sz="0"/>
               <w:left w:val="none" w:color="FFFFFF" w:sz="0"/>
@@ -960,13 +960,13 @@
           </w:tcPr>
           <w:p>
             <w:pPr>
-              <w:spacing w:after="160"/>
-            </w:pPr>
-          </w:p>
-        </w:tc>
-        <w:tc>
-          <w:tcPr>
-            <w:tcW w:type="dxa" w:w="8503"/>
+              <w:spacing w:after="130" w:line="20"/>
+            </w:pPr>
+          </w:p>
+        </w:tc>
+        <w:tc>
+          <w:tcPr>
+            <w:tcW w:type="dxa" w:w="7993"/>
             <w:tcBorders>
               <w:top w:val="none" w:color="FFFFFF" w:sz="0"/>
               <w:left w:val="none" w:color="FFFFFF" w:sz="0"/>
@@ -991,18 +991,18 @@
       <w:tr>
         <w:tc>
           <w:tcPr>
-            <w:tcW w:type="dxa" w:w="1700"/>
-            <w:tcBorders>
-              <w:top w:val="none" w:color="FFFFFF" w:sz="0"/>
-              <w:left w:val="none" w:color="FFFFFF" w:sz="0"/>
-              <w:bottom w:val="none" w:color="FFFFFF" w:sz="0"/>
-              <w:right w:val="none" w:color="FFFFFF" w:sz="0"/>
-            </w:tcBorders>
-            <w:tcMar>
-              <w:top w:type="dxa" w:w="0"/>
-              <w:left w:type="dxa" w:w="0"/>
-              <w:bottom w:type="dxa" w:w="0"/>
-              <w:right w:type="dxa" w:w="226"/>
+            <w:tcW w:type="dxa" w:w="2211"/>
+            <w:tcBorders>
+              <w:top w:val="none" w:color="FFFFFF" w:sz="0"/>
+              <w:left w:val="none" w:color="FFFFFF" w:sz="0"/>
+              <w:bottom w:val="none" w:color="FFFFFF" w:sz="0"/>
+              <w:right w:val="none" w:color="FFFFFF" w:sz="0"/>
+            </w:tcBorders>
+            <w:tcMar>
+              <w:top w:type="dxa" w:w="0"/>
+              <w:left w:type="dxa" w:w="0"/>
+              <w:bottom w:type="dxa" w:w="0"/>
+              <w:right w:type="dxa" w:w="283"/>
             </w:tcMar>
             <w:vAlign w:val="top"/>
           </w:tcPr>
@@ -1013,7 +1013,7 @@
             <w:r>
               <w:drawing>
                 <wp:inline distT="0" distB="0" distL="0" distR="0">
-                  <wp:extent cx="701989" cy="1525475"/>
+                  <wp:extent cx="1224000" cy="2584427"/>
                   <wp:effectExtent t="0" r="0" b="0" l="0"/>
                   <wp:docPr id="5" name="" descr="" title=""/>
                   <wp:cNvGraphicFramePr>
@@ -1038,7 +1038,7 @@
                         <pic:spPr bwMode="auto">
                           <a:xfrm>
                             <a:off x="0" y="0"/>
-                            <a:ext cx="701989" cy="1525475"/>
+                            <a:ext cx="1224000" cy="2584427"/>
                           </a:xfrm>
                           <a:prstGeom prst="rect">
                             <a:avLst/>
@@ -1054,7 +1054,7 @@
         </w:tc>
         <w:tc>
           <w:tcPr>
-            <w:tcW w:type="dxa" w:w="8503"/>
+            <w:tcW w:type="dxa" w:w="7993"/>
             <w:tcBorders>
               <w:top w:val="none" w:color="FFFFFF" w:sz="0"/>
               <w:left w:val="none" w:color="FFFFFF" w:sz="0"/>
@@ -1067,7 +1067,7 @@
               <w:bottom w:type="dxa" w:w="0"/>
               <w:right w:type="dxa" w:w="0"/>
             </w:tcMar>
-            <w:vAlign w:val="top"/>
+            <w:vAlign w:val="center"/>
           </w:tcPr>
           <w:p>
             <w:pPr>
@@ -1131,7 +1131,7 @@
       <w:tr>
         <w:tc>
           <w:tcPr>
-            <w:tcW w:type="dxa" w:w="1700"/>
+            <w:tcW w:type="dxa" w:w="2211"/>
             <w:tcBorders>
               <w:top w:val="none" w:color="FFFFFF" w:sz="0"/>
               <w:left w:val="none" w:color="FFFFFF" w:sz="0"/>
@@ -1148,13 +1148,13 @@
           </w:tcPr>
           <w:p>
             <w:pPr>
-              <w:spacing w:after="160"/>
-            </w:pPr>
-          </w:p>
-        </w:tc>
-        <w:tc>
-          <w:tcPr>
-            <w:tcW w:type="dxa" w:w="8503"/>
+              <w:spacing w:after="130" w:line="20"/>
+            </w:pPr>
+          </w:p>
+        </w:tc>
+        <w:tc>
+          <w:tcPr>
+            <w:tcW w:type="dxa" w:w="7993"/>
             <w:tcBorders>
               <w:top w:val="none" w:color="FFFFFF" w:sz="0"/>
               <w:left w:val="none" w:color="FFFFFF" w:sz="0"/>
@@ -1179,18 +1179,18 @@
       <w:tr>
         <w:tc>
           <w:tcPr>
-            <w:tcW w:type="dxa" w:w="1700"/>
-            <w:tcBorders>
-              <w:top w:val="none" w:color="FFFFFF" w:sz="0"/>
-              <w:left w:val="none" w:color="FFFFFF" w:sz="0"/>
-              <w:bottom w:val="none" w:color="FFFFFF" w:sz="0"/>
-              <w:right w:val="none" w:color="FFFFFF" w:sz="0"/>
-            </w:tcBorders>
-            <w:tcMar>
-              <w:top w:type="dxa" w:w="0"/>
-              <w:left w:type="dxa" w:w="0"/>
-              <w:bottom w:type="dxa" w:w="0"/>
-              <w:right w:type="dxa" w:w="226"/>
+            <w:tcW w:type="dxa" w:w="2211"/>
+            <w:tcBorders>
+              <w:top w:val="none" w:color="FFFFFF" w:sz="0"/>
+              <w:left w:val="none" w:color="FFFFFF" w:sz="0"/>
+              <w:bottom w:val="none" w:color="FFFFFF" w:sz="0"/>
+              <w:right w:val="none" w:color="FFFFFF" w:sz="0"/>
+            </w:tcBorders>
+            <w:tcMar>
+              <w:top w:type="dxa" w:w="0"/>
+              <w:left w:type="dxa" w:w="0"/>
+              <w:bottom w:type="dxa" w:w="0"/>
+              <w:right w:type="dxa" w:w="283"/>
             </w:tcMar>
             <w:vAlign w:val="top"/>
           </w:tcPr>
@@ -1201,7 +1201,7 @@
             <w:r>
               <w:drawing>
                 <wp:inline distT="0" distB="0" distL="0" distR="0">
-                  <wp:extent cx="701989" cy="1525475"/>
+                  <wp:extent cx="1224000" cy="2584427"/>
                   <wp:effectExtent t="0" r="0" b="0" l="0"/>
                   <wp:docPr id="6" name="" descr="" title=""/>
                   <wp:cNvGraphicFramePr>
@@ -1226,7 +1226,7 @@
                         <pic:spPr bwMode="auto">
                           <a:xfrm>
                             <a:off x="0" y="0"/>
-                            <a:ext cx="701989" cy="1525475"/>
+                            <a:ext cx="1224000" cy="2584427"/>
                           </a:xfrm>
                           <a:prstGeom prst="rect">
                             <a:avLst/>
@@ -1242,7 +1242,7 @@
         </w:tc>
         <w:tc>
           <w:tcPr>
-            <w:tcW w:type="dxa" w:w="8503"/>
+            <w:tcW w:type="dxa" w:w="7993"/>
             <w:tcBorders>
               <w:top w:val="none" w:color="FFFFFF" w:sz="0"/>
               <w:left w:val="none" w:color="FFFFFF" w:sz="0"/>
@@ -1255,7 +1255,7 @@
               <w:bottom w:type="dxa" w:w="0"/>
               <w:right w:type="dxa" w:w="0"/>
             </w:tcMar>
-            <w:vAlign w:val="top"/>
+            <w:vAlign w:val="center"/>
           </w:tcPr>
           <w:p>
             <w:pPr>
@@ -1319,7 +1319,7 @@
       <w:tr>
         <w:tc>
           <w:tcPr>
-            <w:tcW w:type="dxa" w:w="1700"/>
+            <w:tcW w:type="dxa" w:w="2211"/>
             <w:tcBorders>
               <w:top w:val="none" w:color="FFFFFF" w:sz="0"/>
               <w:left w:val="none" w:color="FFFFFF" w:sz="0"/>
@@ -1336,13 +1336,13 @@
           </w:tcPr>
           <w:p>
             <w:pPr>
-              <w:spacing w:after="160"/>
-            </w:pPr>
-          </w:p>
-        </w:tc>
-        <w:tc>
-          <w:tcPr>
-            <w:tcW w:type="dxa" w:w="8503"/>
+              <w:spacing w:after="130" w:line="20"/>
+            </w:pPr>
+          </w:p>
+        </w:tc>
+        <w:tc>
+          <w:tcPr>
+            <w:tcW w:type="dxa" w:w="7993"/>
             <w:tcBorders>
               <w:top w:val="none" w:color="FFFFFF" w:sz="0"/>
               <w:left w:val="none" w:color="FFFFFF" w:sz="0"/>
@@ -1367,18 +1367,18 @@
       <w:tr>
         <w:tc>
           <w:tcPr>
-            <w:tcW w:type="dxa" w:w="1700"/>
-            <w:tcBorders>
-              <w:top w:val="none" w:color="FFFFFF" w:sz="0"/>
-              <w:left w:val="none" w:color="FFFFFF" w:sz="0"/>
-              <w:bottom w:val="none" w:color="FFFFFF" w:sz="0"/>
-              <w:right w:val="none" w:color="FFFFFF" w:sz="0"/>
-            </w:tcBorders>
-            <w:tcMar>
-              <w:top w:type="dxa" w:w="0"/>
-              <w:left w:type="dxa" w:w="0"/>
-              <w:bottom w:type="dxa" w:w="0"/>
-              <w:right w:type="dxa" w:w="226"/>
+            <w:tcW w:type="dxa" w:w="2211"/>
+            <w:tcBorders>
+              <w:top w:val="none" w:color="FFFFFF" w:sz="0"/>
+              <w:left w:val="none" w:color="FFFFFF" w:sz="0"/>
+              <w:bottom w:val="none" w:color="FFFFFF" w:sz="0"/>
+              <w:right w:val="none" w:color="FFFFFF" w:sz="0"/>
+            </w:tcBorders>
+            <w:tcMar>
+              <w:top w:type="dxa" w:w="0"/>
+              <w:left w:type="dxa" w:w="0"/>
+              <w:bottom w:type="dxa" w:w="0"/>
+              <w:right w:type="dxa" w:w="283"/>
             </w:tcMar>
             <w:vAlign w:val="top"/>
           </w:tcPr>
@@ -1389,7 +1389,7 @@
             <w:r>
               <w:drawing>
                 <wp:inline distT="0" distB="0" distL="0" distR="0">
-                  <wp:extent cx="701989" cy="1525475"/>
+                  <wp:extent cx="1224000" cy="2584427"/>
                   <wp:effectExtent t="0" r="0" b="0" l="0"/>
                   <wp:docPr id="7" name="" descr="" title=""/>
                   <wp:cNvGraphicFramePr>
@@ -1414,7 +1414,7 @@
                         <pic:spPr bwMode="auto">
                           <a:xfrm>
                             <a:off x="0" y="0"/>
-                            <a:ext cx="701989" cy="1525475"/>
+                            <a:ext cx="1224000" cy="2584427"/>
                           </a:xfrm>
                           <a:prstGeom prst="rect">
                             <a:avLst/>
@@ -1430,7 +1430,7 @@
         </w:tc>
         <w:tc>
           <w:tcPr>
-            <w:tcW w:type="dxa" w:w="8503"/>
+            <w:tcW w:type="dxa" w:w="7993"/>
             <w:tcBorders>
               <w:top w:val="none" w:color="FFFFFF" w:sz="0"/>
               <w:left w:val="none" w:color="FFFFFF" w:sz="0"/>
@@ -1443,7 +1443,7 @@
               <w:bottom w:type="dxa" w:w="0"/>
               <w:right w:type="dxa" w:w="0"/>
             </w:tcMar>
-            <w:vAlign w:val="top"/>
+            <w:vAlign w:val="center"/>
           </w:tcPr>
           <w:p>
             <w:pPr>
@@ -1510,12 +1510,12 @@
         <w:pBdr>
           <w:bottom w:val="single" w:color="E2E5E1" w:sz="4" w:space="4"/>
         </w:pBdr>
-        <w:spacing w:after="120" w:before="240"/>
+        <w:spacing w:after="100" w:before="200" w:line="20"/>
       </w:pPr>
     </w:p>
     <w:tbl>
       <w:tblPr>
-        <w:tblW w:type="dxa" w:w="10203"/>
+        <w:tblW w:type="dxa" w:w="10204"/>
         <w:tblBorders>
           <w:top w:val="none" w:color="FFFFFF" w:sz="0"/>
           <w:left w:val="none" w:color="FFFFFF" w:sz="0"/>
@@ -1526,24 +1526,24 @@
         </w:tblBorders>
       </w:tblPr>
       <w:tblGrid>
-        <w:gridCol w:w="1700"/>
-        <w:gridCol w:w="8503"/>
+        <w:gridCol w:w="1757"/>
+        <w:gridCol w:w="8447"/>
       </w:tblGrid>
       <w:tr>
         <w:tc>
           <w:tcPr>
-            <w:tcW w:type="dxa" w:w="1700"/>
-            <w:tcBorders>
-              <w:top w:val="none" w:color="FFFFFF" w:sz="0"/>
-              <w:left w:val="none" w:color="FFFFFF" w:sz="0"/>
-              <w:bottom w:val="none" w:color="FFFFFF" w:sz="0"/>
-              <w:right w:val="none" w:color="FFFFFF" w:sz="0"/>
-            </w:tcBorders>
-            <w:tcMar>
-              <w:top w:type="dxa" w:w="0"/>
-              <w:left w:type="dxa" w:w="0"/>
-              <w:bottom w:type="dxa" w:w="0"/>
-              <w:right w:type="dxa" w:w="226"/>
+            <w:tcW w:type="dxa" w:w="1757"/>
+            <w:tcBorders>
+              <w:top w:val="none" w:color="FFFFFF" w:sz="0"/>
+              <w:left w:val="none" w:color="FFFFFF" w:sz="0"/>
+              <w:bottom w:val="none" w:color="FFFFFF" w:sz="0"/>
+              <w:right w:val="none" w:color="FFFFFF" w:sz="0"/>
+            </w:tcBorders>
+            <w:tcMar>
+              <w:top w:type="dxa" w:w="0"/>
+              <w:left w:type="dxa" w:w="0"/>
+              <w:bottom w:type="dxa" w:w="0"/>
+              <w:right w:type="dxa" w:w="283"/>
             </w:tcMar>
             <w:vAlign w:val="top"/>
           </w:tcPr>
@@ -1554,7 +1554,7 @@
             <w:r>
               <w:drawing>
                 <wp:inline distT="0" distB="0" distL="0" distR="0">
-                  <wp:extent cx="701989" cy="701989"/>
+                  <wp:extent cx="792000" cy="792000"/>
                   <wp:effectExtent t="0" r="0" b="0" l="0"/>
                   <wp:docPr id="9" name="" descr="" title=""/>
                   <wp:cNvGraphicFramePr>
@@ -1579,7 +1579,7 @@
                         <pic:spPr bwMode="auto">
                           <a:xfrm>
                             <a:off x="0" y="0"/>
-                            <a:ext cx="701989" cy="701989"/>
+                            <a:ext cx="792000" cy="792000"/>
                           </a:xfrm>
                           <a:prstGeom prst="rect">
                             <a:avLst/>
@@ -1595,7 +1595,7 @@
         </w:tc>
         <w:tc>
           <w:tcPr>
-            <w:tcW w:type="dxa" w:w="8503"/>
+            <w:tcW w:type="dxa" w:w="8447"/>
             <w:tcBorders>
               <w:top w:val="none" w:color="FFFFFF" w:sz="0"/>
               <w:left w:val="none" w:color="FFFFFF" w:sz="0"/>

</xml_diff>